<commit_message>
Risk Assessment and Requirements: update to current Iteration 3 status
Risk Assessment: removed the review notes and yellow highlighting; updated each
risk to what was actually done (credentials rotated, RDS access fixed, ownership
fix with 13 tests / 95 total, billing alarm in progress, per-person branches).
Requirements: Noah's new AWS paragraph now says Treasure Row, and the
confirmation number format is TR-YYMMDD-XXXXXX to match the code.

Edited by Donovan Griffin on Noah's branch.

Co-Authored-By: Claude Opus 5.5 <noreply@anthropic.com>
</commit_message>
<xml_diff>
--- a/docs/risk-assessment/Risk_Assessment_TreasureRow.docx
+++ b/docs/risk-assessment/Risk_Assessment_TreasureRow.docx
@@ -31,14 +31,6 @@
       </w:r>
     </w:p>
     <w:p>
-      <w:r>
-        <w:rPr>
-          <w:highlight w:val="yellow"/>
-        </w:rPr>
-        <w:t>Revision note: Yellow highlighting marks revised or newly added wording. Ratings and technical claims should be confirmed against the current AWS configuration, repository, and test results before submission.</w:t>
-      </w:r>
-    </w:p>
-    <w:p>
       <w:pPr>
         <w:spacing w:after="280"/>
       </w:pPr>
@@ -71,10 +63,8 @@
         <w:spacing w:after="120"/>
       </w:pPr>
       <w:r>
-        <w:rPr>
-          <w:highlight w:val="yellow"/>
-        </w:rPr>
-        <w:t>Each risk is assessed using a qualitative Likelihood × Impact matrix, informed by the risk-assessment approach in NIST SP 800-30 Rev. 1. These ratings are project estimates, not measured probabilities, and should be reviewed as the system and its deployment change.</w:t>
+        <w:rPr/>
+        <w:t xml:space="preserve">Each risk is assessed using a qualitative Likelihood × Impact matrix, based on the risk-assessment approach in NIST SP 800-30 Rev. 1. Ratings are the team's estimates and are reviewed each iteration.</w:t>
       </w:r>
     </w:p>
     <w:p>
@@ -83,10 +73,8 @@
         <w:spacing w:after="40"/>
       </w:pPr>
       <w:r>
-        <w:rPr>
-          <w:highlight w:val="yellow"/>
-        </w:rPr>
-        <w:t>Likelihood: the estimated chance that the risk will occur during the project period. If the issue has already occurred or is currently present, that evidence should be stated.</w:t>
+        <w:rPr/>
+        <w:t xml:space="preserve">Likelihood: the chance that the risk will occur during the project period.</w:t>
       </w:r>
     </w:p>
     <w:p>
@@ -95,10 +83,8 @@
         <w:spacing w:after="40"/>
       </w:pPr>
       <w:r>
-        <w:rPr>
-          <w:highlight w:val="yellow"/>
-        </w:rPr>
-        <w:t>Impact: the expected severity if the risk occurs, considering confidentiality, integrity, availability, cost, schedule, and user trust as applicable.</w:t>
+        <w:rPr/>
+        <w:t xml:space="preserve">Impact: how severe the result would be, considering confidentiality, integrity, availability, cost, schedule, and user trust.</w:t>
       </w:r>
     </w:p>
     <w:p>
@@ -107,10 +93,8 @@
         <w:spacing w:after="40"/>
       </w:pPr>
       <w:r>
-        <w:rPr>
-          <w:highlight w:val="yellow"/>
-        </w:rPr>
-        <w:t>Overall rating: the matrix below maps likelihood and impact to Low, Medium, High, or Critical. Record both the current rating and the residual rating after controls are verified.</w:t>
+        <w:rPr/>
+        <w:t xml:space="preserve">Overall rating: the matrix below maps likelihood and impact to Low, Medium, High, or Critical. Each risk lists its current rating after the Iteration 3 fixes.</w:t>
       </w:r>
     </w:p>
     <w:p>
@@ -118,9 +102,7 @@
         <w:spacing w:after="60"/>
       </w:pPr>
       <w:r>
-        <w:rPr>
-          <w:highlight w:val="yellow"/>
-        </w:rPr>
+        <w:rPr/>
         <w:t>Rating guide (Likelihood × Impact)</w:t>
       </w:r>
     </w:p>
@@ -130,9 +112,7 @@
         <w:spacing w:after="40"/>
       </w:pPr>
       <w:r>
-        <w:rPr>
-          <w:highlight w:val="yellow"/>
-        </w:rPr>
+        <w:rPr/>
         <w:t>Low likelihood: Low or Medium impact = Low; High impact = Medium</w:t>
       </w:r>
     </w:p>
@@ -142,9 +122,7 @@
         <w:spacing w:after="40"/>
       </w:pPr>
       <w:r>
-        <w:rPr>
-          <w:highlight w:val="yellow"/>
-        </w:rPr>
+        <w:rPr/>
         <w:t>Medium likelihood: Low impact = Low; Medium impact = Medium; High impact = High</w:t>
       </w:r>
     </w:p>
@@ -154,9 +132,7 @@
         <w:spacing w:after="40"/>
       </w:pPr>
       <w:r>
-        <w:rPr>
-          <w:highlight w:val="yellow"/>
-        </w:rPr>
+        <w:rPr/>
         <w:t>High likelihood: Low impact = Medium; Medium impact = High; High impact = Critical</w:t>
       </w:r>
     </w:p>
@@ -180,10 +156,8 @@
         <w:spacing w:after="40"/>
       </w:pPr>
       <w:r>
-        <w:rPr>
-          <w:highlight w:val="yellow"/>
-        </w:rPr>
-        <w:t>Current risk level: Medium (residual rating should be confirmed after alerts and resource shutdown procedures are tested)</w:t>
+        <w:rPr/>
+        <w:t xml:space="preserve">Current risk level: Medium</w:t>
       </w:r>
     </w:p>
     <w:p>
@@ -192,10 +166,8 @@
         <w:spacing w:after="40"/>
       </w:pPr>
       <w:r>
-        <w:rPr>
-          <w:highlight w:val="yellow"/>
-        </w:rPr>
-        <w:t>Likelihood: Medium (AWS resources are running and billing alerts were not configured at the time of assessment)</w:t>
+        <w:rPr/>
+        <w:t xml:space="preserve">Likelihood: Medium (RDS, Elastic Beanstalk, and S3 run continuously on AWS promotional credits)</w:t>
       </w:r>
     </w:p>
     <w:p>
@@ -204,10 +176,8 @@
         <w:spacing w:after="40"/>
       </w:pPr>
       <w:r>
-        <w:rPr>
-          <w:highlight w:val="yellow"/>
-        </w:rPr>
-        <w:t>Impact: Medium (unexpected charges could consume project funds or credits; the actual exposure depends on resource usage and account limits)</w:t>
+        <w:rPr/>
+        <w:t xml:space="preserve">Impact: Medium (unexpected charges could use up the team's AWS credits)</w:t>
       </w:r>
     </w:p>
     <w:p>
@@ -230,10 +200,8 @@
         <w:spacing w:after="40"/>
       </w:pPr>
       <w:r>
-        <w:rPr>
-          <w:highlight w:val="yellow"/>
-        </w:rPr>
-        <w:t>AWS resources currently in use include RDS, Elastic Beanstalk, and S3. Confirm the complete resource inventory and whether any resources are publicly accessible.</w:t>
+        <w:rPr/>
+        <w:t xml:space="preserve">AWS resources in use: the RDS PostgreSQL database (treasurerow-db), one Elastic Beanstalk environment on a single t3.micro instance, and one S3 bucket for images, all in us-east-2. The database is not publicly accessible; only the Elastic Beanstalk server and approved IP addresses can connect.</w:t>
       </w:r>
     </w:p>
     <w:p>
@@ -242,10 +210,8 @@
         <w:spacing w:after="40"/>
       </w:pPr>
       <w:r>
-        <w:rPr>
-          <w:highlight w:val="yellow"/>
-        </w:rPr>
-        <w:t>Billing alerts were not configured at the time of assessment. Alerts notify the team but do not, by themselves, stop charges.</w:t>
+        <w:rPr/>
+        <w:t xml:space="preserve">Before Iteration 3 there was no billing alert, and an alert only notifies the team; it does not stop charges.</w:t>
       </w:r>
     </w:p>
     <w:p>
@@ -254,10 +220,8 @@
         <w:spacing w:after="40"/>
       </w:pPr>
       <w:r>
-        <w:rPr>
-          <w:highlight w:val="yellow"/>
-        </w:rPr>
-        <w:t>Free Tier eligibility and limits vary by service and account. Usage beyond an applicable limit can create charges, so do not rely on Free Tier status as a spending safeguard.</w:t>
+        <w:rPr/>
+        <w:t xml:space="preserve">Free Tier limits vary by service, so the team does not rely on the Free Tier to prevent charges.</w:t>
       </w:r>
     </w:p>
     <w:p>
@@ -280,10 +244,8 @@
         <w:spacing w:after="40"/>
       </w:pPr>
       <w:r>
-        <w:rPr>
-          <w:highlight w:val="yellow"/>
-        </w:rPr>
-        <w:t>Configure AWS Budgets with actual-cost and forecast alerts at agreed thresholds, and send notifications to at least two responsible team members.</w:t>
+        <w:rPr/>
+        <w:t xml:space="preserve">An AWS Budgets alarm is being set up in Iteration 3 ($25 per month, with alerts at 80% of actual spending and 100% of forecasted spending), sent to the project manager and the AWS lead.</w:t>
       </w:r>
     </w:p>
     <w:p>
@@ -292,10 +254,8 @@
         <w:spacing w:after="40"/>
       </w:pPr>
       <w:r>
-        <w:rPr>
-          <w:highlight w:val="yellow"/>
-        </w:rPr>
-        <w:t>Assign a named owner to review cost and usage weekly during active development and monthly during low activity; record the review and follow up on unexpected charges.</w:t>
+        <w:rPr/>
+        <w:t xml:space="preserve">Donovan reviews AWS cost and usage weekly while the app is in active development.</w:t>
       </w:r>
     </w:p>
     <w:p>
@@ -304,10 +264,8 @@
         <w:spacing w:after="40"/>
       </w:pPr>
       <w:r>
-        <w:rPr>
-          <w:highlight w:val="yellow"/>
-        </w:rPr>
-        <w:t>Document how to stop or delete non-essential resources between iterations, and verify that stopping a resource will not cause data loss or disrupt required services.</w:t>
+        <w:rPr/>
+        <w:t xml:space="preserve">The AWS runbook (docs/aws-runbook/README.md, Jonah Goodwine) documents how to shut the environment down between demos and bring it back without losing data.</w:t>
       </w:r>
     </w:p>
     <w:p>
@@ -330,10 +288,8 @@
         <w:spacing w:after="40"/>
       </w:pPr>
       <w:r>
-        <w:rPr>
-          <w:highlight w:val="yellow"/>
-        </w:rPr>
-        <w:t>Initial risk: High. Residual risk: Medium only after the runbook and fallback have been tested successfully.</w:t>
+        <w:rPr/>
+        <w:t xml:space="preserve">Initial risk: High. Current risk: Low (fixed in Iteration 3).</w:t>
       </w:r>
     </w:p>
     <w:p>
@@ -342,10 +298,8 @@
         <w:spacing w:after="40"/>
       </w:pPr>
       <w:r>
-        <w:rPr>
-          <w:highlight w:val="yellow"/>
-        </w:rPr>
-        <w:t>Likelihood: High before mitigation (the access problem has already occurred). Reassess after the runbook and fallback are validated.</w:t>
+        <w:rPr/>
+        <w:t xml:space="preserve">Likelihood: Low after the fix (the problem happened before Iteration 3, when members' IP addresses were not in the security group).</w:t>
       </w:r>
     </w:p>
     <w:p>
@@ -354,10 +308,8 @@
         <w:spacing w:after="40"/>
       </w:pPr>
       <w:r>
-        <w:rPr>
-          <w:highlight w:val="yellow"/>
-        </w:rPr>
-        <w:t>Impact: Medium (database access interruptions delay development and testing; no live-user outage was reported in this assessment).</w:t>
+        <w:rPr/>
+        <w:t xml:space="preserve">Impact: Medium (losing database access delays development and testing; it does not affect the live site).</w:t>
       </w:r>
     </w:p>
     <w:p>
@@ -380,10 +332,8 @@
         <w:spacing w:after="40"/>
       </w:pPr>
       <w:r>
-        <w:rPr>
-          <w:highlight w:val="yellow"/>
-        </w:rPr>
-        <w:t>RDS and other AWS resources are used during development and may be stopped to reduce cost when they are not needed. Document which resources can safely be stopped and how to restart them.</w:t>
+        <w:rPr/>
+        <w:t xml:space="preserve">The team develops against the live RDS database, so losing access stops local development.</w:t>
       </w:r>
     </w:p>
     <w:p>
@@ -392,10 +342,8 @@
         <w:spacing w:after="40"/>
       </w:pPr>
       <w:r>
-        <w:rPr>
-          <w:highlight w:val="yellow"/>
-        </w:rPr>
-        <w:t>The RDS security group restricts inbound connections to configured sources. Access depends on the current network address and the relevant security-group rules.</w:t>
+        <w:rPr/>
+        <w:t xml:space="preserve">The RDS security group only allows connections from listed sources.</w:t>
       </w:r>
     </w:p>
     <w:p>
@@ -404,10 +352,8 @@
         <w:spacing w:after="40"/>
       </w:pPr>
       <w:r>
-        <w:rPr>
-          <w:highlight w:val="yellow"/>
-        </w:rPr>
-        <w:t>Moving between networks, such as campus and home, can change the public IP address and prevent a developer from connecting.</w:t>
+        <w:rPr/>
+        <w:t xml:space="preserve">Moving between networks, such as campus and home, changes a member's public IP address, which then blocks their connection.</w:t>
       </w:r>
     </w:p>
     <w:p>
@@ -430,10 +376,8 @@
         <w:spacing w:after="40"/>
       </w:pPr>
       <w:r>
-        <w:rPr>
-          <w:highlight w:val="yellow"/>
-        </w:rPr>
-        <w:t>Maintain a tested runbook for checking the current public IP, updating the minimum required security-group rule, starting the database if needed, and removing temporary access rules afterward. Never open the database to all IP addresses as a workaround.</w:t>
+        <w:rPr/>
+        <w:t xml:space="preserve">The security group now allows the Elastic Beanstalk server, each member's IP address, and the Hampton campus range (137.198.190.0/24); a live connection from campus was verified on October 27, 2026. The steps to check your IP and add a rule are in the AWS runbook. The database is never opened to all IP addresses (0.0.0.0/0).</w:t>
       </w:r>
     </w:p>
     <w:p>
@@ -442,10 +386,8 @@
         <w:spacing w:after="40"/>
       </w:pPr>
       <w:r>
-        <w:rPr>
-          <w:highlight w:val="yellow"/>
-        </w:rPr>
-        <w:t>Assign Jonah as the configuration owner, with a second team member able to follow the documented process if the owner is unavailable.</w:t>
+        <w:rPr/>
+        <w:t xml:space="preserve">Jonah owns the AWS configuration; Donovan can follow the runbook when Jonah is unavailable.</w:t>
       </w:r>
     </w:p>
     <w:p>
@@ -454,10 +396,8 @@
         <w:spacing w:after="40"/>
       </w:pPr>
       <w:r>
-        <w:rPr>
-          <w:highlight w:val="yellow"/>
-        </w:rPr>
-        <w:t>Maintain a local PostgreSQL fallback and document how to seed representative test data so routine development can continue without AWS access.</w:t>
+        <w:rPr/>
+        <w:t xml:space="preserve">The automated tests run against a separate local PostgreSQL test database, so testing continues without AWS access (see the app README).</w:t>
       </w:r>
     </w:p>
     <w:p>
@@ -480,10 +420,8 @@
         <w:spacing w:after="40"/>
       </w:pPr>
       <w:r>
-        <w:rPr>
-          <w:highlight w:val="yellow"/>
-        </w:rPr>
-        <w:t>Current risk level: Critical until all exposed credentials have been revoked or rotated and the repository has been checked. Do not lower this rating based only on moving secrets to a .env file.</w:t>
+        <w:rPr/>
+        <w:t xml:space="preserve">Current risk level: Low (initial risk: Critical; fixed in Iteration 3).</w:t>
       </w:r>
     </w:p>
     <w:p>
@@ -492,10 +430,8 @@
         <w:spacing w:after="40"/>
       </w:pPr>
       <w:r>
-        <w:rPr>
-          <w:highlight w:val="yellow"/>
-        </w:rPr>
-        <w:t>Likelihood: High (the assessment reports that credentials were committed in plaintext). Treat a committed secret as exposed even if the repository is private.</w:t>
+        <w:rPr/>
+        <w:t xml:space="preserve">Likelihood: Low after the fix (credentials had been committed in plaintext before Iteration 3).</w:t>
       </w:r>
     </w:p>
     <w:p>
@@ -504,10 +440,8 @@
         <w:spacing w:after="40"/>
       </w:pPr>
       <w:r>
-        <w:rPr>
-          <w:highlight w:val="yellow"/>
-        </w:rPr>
-        <w:t>Impact: High (a valid credential may permit unauthorized access to AWS resources, data, or billable services; the exact permissions and exposure period must be verified).</w:t>
+        <w:rPr/>
+        <w:t xml:space="preserve">Impact: High (a working credential could give access to the database, stored images, or billable AWS services).</w:t>
       </w:r>
     </w:p>
     <w:p>
@@ -530,10 +464,8 @@
         <w:spacing w:after="40"/>
       </w:pPr>
       <w:r>
-        <w:rPr>
-          <w:highlight w:val="yellow"/>
-        </w:rPr>
-        <w:t>The review found a configuration file, a hardcoded secret key, and a hardcoded administrator login. Confirm each item’s purpose and whether it is still active.</w:t>
+        <w:rPr/>
+        <w:t xml:space="preserve">Earlier versions had a configuration file with credentials, a hardcoded secret key, and a hardcoded administrator login.</w:t>
       </w:r>
     </w:p>
     <w:p>
@@ -542,10 +474,8 @@
         <w:spacing w:after="40"/>
       </w:pPr>
       <w:r>
-        <w:rPr>
-          <w:highlight w:val="yellow"/>
-        </w:rPr>
-        <w:t>AWS credentials were committed to source control in plaintext. Removing them from the latest version does not remove them from repository history or make them safe to reuse.</w:t>
+        <w:rPr/>
+        <w:t xml:space="preserve">AWS credentials had been committed to source control in plaintext. Deleting them from the latest version does not remove them from the git history, so they had to be replaced.</w:t>
       </w:r>
     </w:p>
     <w:p>
@@ -554,10 +484,8 @@
         <w:spacing w:after="40"/>
       </w:pPr>
       <w:r>
-        <w:rPr>
-          <w:highlight w:val="yellow"/>
-        </w:rPr>
-        <w:t>Depending on the permissions granted, exposed credentials could allow access to the database, stored images, or other AWS resources.</w:t>
+        <w:rPr/>
+        <w:t xml:space="preserve">Anyone with those credentials could have reached the database, the stored images, or other AWS resources.</w:t>
       </w:r>
     </w:p>
     <w:p>
@@ -580,10 +508,8 @@
         <w:spacing w:after="40"/>
       </w:pPr>
       <w:r>
-        <w:rPr>
-          <w:highlight w:val="yellow"/>
-        </w:rPr>
-        <w:t>Move secrets out of source control and use an approved secret store or environment-based configuration appropriate to the deployment. A local .env file is acceptable only for local development, must be excluded by .gitignore, and must never contain credentials that remain active after exposure.</w:t>
+        <w:rPr/>
+        <w:t xml:space="preserve">All secrets now come from environment variables: a local .env file (excluded by .gitignore) during development and the Elastic Beanstalk environment configuration in production. The administrator login is also read from environment variables.</w:t>
       </w:r>
     </w:p>
     <w:p>
@@ -592,10 +518,8 @@
         <w:spacing w:after="40"/>
       </w:pPr>
       <w:r>
-        <w:rPr>
-          <w:highlight w:val="yellow"/>
-        </w:rPr>
-        <w:t>Immediately revoke or rotate every credential that was exposed, review CloudTrail and other available logs for unexpected use, and apply least-privilege permissions. Confirm the old credentials no longer work.</w:t>
+        <w:rPr/>
+        <w:t xml:space="preserve">The exposed credentials were replaced with new ones issued by Jonah Goodwine and shared only through the team's private group chat. In Iteration 3 the team verified that the current database password and S3 keys appear nowhere in the git history.</w:t>
       </w:r>
     </w:p>
     <w:p>
@@ -604,10 +528,8 @@
         <w:spacing w:after="40"/>
       </w:pPr>
       <w:r>
-        <w:rPr>
-          <w:highlight w:val="yellow"/>
-        </w:rPr>
-        <w:t>Add automated secret scanning to commits or pull requests and periodically scan repository history. Document the owner and completion status of remediation before marking this risk reduced.</w:t>
+        <w:rPr/>
+        <w:t xml:space="preserve">The app refuses to start without a SECRET_KEY or with a placeholder value such as change-me, so a guessable key can't be used to forge login cookies (Noah Higgs, SCRUM-61). Any credential that is ever committed again will be rotated.</w:t>
       </w:r>
     </w:p>
     <w:p>
@@ -630,10 +552,8 @@
         <w:spacing w:after="40"/>
       </w:pPr>
       <w:r>
-        <w:rPr>
-          <w:highlight w:val="yellow"/>
-        </w:rPr>
-        <w:t>Residual risk: Low only after the authorization fix and regression tests are verified in the current build; initial risk was High.</w:t>
+        <w:rPr/>
+        <w:t xml:space="preserve">Current risk: Low (initial risk: High; fixed in Iteration 3).</w:t>
       </w:r>
     </w:p>
     <w:p>
@@ -642,10 +562,8 @@
         <w:spacing w:after="40"/>
       </w:pPr>
       <w:r>
-        <w:rPr>
-          <w:highlight w:val="yellow"/>
-        </w:rPr>
-        <w:t>Likelihood after mitigation: Low based on the reported fix and regression tests. Reassess if authorization logic or account-related endpoints change.</w:t>
+        <w:rPr/>
+        <w:t xml:space="preserve">Likelihood: Low, because ownership is now checked on the server and covered by automated tests.</w:t>
       </w:r>
     </w:p>
     <w:p>
@@ -654,9 +572,7 @@
         <w:spacing w:after="40"/>
       </w:pPr>
       <w:r>
-        <w:rPr>
-          <w:highlight w:val="yellow"/>
-        </w:rPr>
+        <w:rPr/>
         <w:t>Impact if it recurs: High because one user could access or modify another user’s listings or data.</w:t>
       </w:r>
     </w:p>
@@ -680,9 +596,7 @@
         <w:spacing w:after="40"/>
       </w:pPr>
       <w:r>
-        <w:rPr>
-          <w:highlight w:val="yellow"/>
-        </w:rPr>
+        <w:rPr/>
         <w:t>During Iteration 1, one account could view and delete another account’s listings.</w:t>
       </w:r>
     </w:p>
@@ -692,10 +606,8 @@
         <w:spacing w:after="40"/>
       </w:pPr>
       <w:r>
-        <w:rPr>
-          <w:highlight w:val="yellow"/>
-        </w:rPr>
-        <w:t>The original assessment attributes the issue to stale browser cache. Because cross-account access is an authorization failure, verify the root cause in server code and tests rather than assuming the cache was the only cause.</w:t>
+        <w:rPr/>
+        <w:t xml:space="preserve">The cause was in the server: it trusted a user ID sent by the browser (a cached value or an X-User-Id header) instead of the signed-in session.</w:t>
       </w:r>
     </w:p>
     <w:p>
@@ -704,10 +616,8 @@
         <w:spacing w:after="40"/>
       </w:pPr>
       <w:r>
-        <w:rPr>
-          <w:highlight w:val="yellow"/>
-        </w:rPr>
-        <w:t>If the server does not enforce ownership on every relevant request, the issue could expose user data or allow unauthorized changes.</w:t>
+        <w:rPr/>
+        <w:t xml:space="preserve">Without a server-side check, any user could change or delete another user's data by sending a different user ID.</w:t>
       </w:r>
     </w:p>
     <w:p>
@@ -730,10 +640,8 @@
         <w:spacing w:after="40"/>
       </w:pPr>
       <w:r>
-        <w:rPr>
-          <w:highlight w:val="yellow"/>
-        </w:rPr>
-        <w:t>Enforce authentication and object-level authorization on the server for every read, update, and delete operation. Treat client-side state and browser caches as untrusted; do not use them as the source of identity or permission.</w:t>
+        <w:rPr/>
+        <w:t xml:space="preserve">The server now takes the user's identity only from the login session (get_session_user) and ignores user IDs sent by the browser; every listing, storefront, wishlist, order, and return request checks ownership.</w:t>
       </w:r>
     </w:p>
     <w:p>
@@ -742,10 +650,8 @@
         <w:spacing w:after="40"/>
       </w:pPr>
       <w:r>
-        <w:rPr>
-          <w:highlight w:val="yellow"/>
-        </w:rPr>
-        <w:t>The team reports 19 regression tests. Confirm that they cover cross-account access for listing reads, edits, and deletions, including direct API requests.</w:t>
+        <w:rPr/>
+        <w:t xml:space="preserve">test_ownership.py has 13 tests for cross-account reads, edits, and deletes, including direct API requests; the full suite of 95 automated tests passes.</w:t>
       </w:r>
     </w:p>
     <w:p>
@@ -754,10 +660,8 @@
         <w:spacing w:after="40"/>
       </w:pPr>
       <w:r>
-        <w:rPr>
-          <w:highlight w:val="yellow"/>
-        </w:rPr>
-        <w:t>Require automated tests and code review for authorization-sensitive changes before merging; record test results in the pull request or iteration notes.</w:t>
+        <w:rPr/>
+        <w:t xml:space="preserve">Changes are reviewed in a pull request, and the tests are run before merging.</w:t>
       </w:r>
     </w:p>
     <w:p>
@@ -780,10 +684,8 @@
         <w:spacing w:after="40"/>
       </w:pPr>
       <w:r>
-        <w:rPr>
-          <w:highlight w:val="yellow"/>
-        </w:rPr>
-        <w:t>Risk level: Medium (qualitative estimate; reassess based on branch age, merge conflicts, and missed integration issues).</w:t>
+        <w:rPr/>
+        <w:t xml:space="preserve">Risk level: Medium</w:t>
       </w:r>
     </w:p>
     <w:p>
@@ -792,9 +694,7 @@
         <w:spacing w:after="40"/>
       </w:pPr>
       <w:r>
-        <w:rPr>
-          <w:highlight w:val="yellow"/>
-        </w:rPr>
+        <w:rPr/>
         <w:t>Likelihood: Medium because parallel branches can diverge when changes remain unmerged or team decisions are not shared.</w:t>
       </w:r>
     </w:p>
@@ -804,9 +704,7 @@
         <w:spacing w:after="40"/>
       </w:pPr>
       <w:r>
-        <w:rPr>
-          <w:highlight w:val="yellow"/>
-        </w:rPr>
+        <w:rPr/>
         <w:t>Impact: Medium because divergence can cause rework, integration defects, or missed deadlines.</w:t>
       </w:r>
     </w:p>
@@ -830,9 +728,7 @@
         <w:spacing w:after="40"/>
       </w:pPr>
       <w:r>
-        <w:rPr>
-          <w:highlight w:val="yellow"/>
-        </w:rPr>
+        <w:rPr/>
         <w:t>Long-lived branches may diverge from the shared branch, increasing merge conflicts and the chance that work is integrated against outdated assumptions.</w:t>
       </w:r>
     </w:p>
@@ -842,9 +738,7 @@
         <w:spacing w:after="40"/>
       </w:pPr>
       <w:r>
-        <w:rPr>
-          <w:highlight w:val="yellow"/>
-        </w:rPr>
+        <w:rPr/>
         <w:t>A feature may be implemented before its requirements and acceptance criteria have been agreed and recorded.</w:t>
       </w:r>
     </w:p>
@@ -854,9 +748,7 @@
         <w:spacing w:after="40"/>
       </w:pPr>
       <w:r>
-        <w:rPr>
-          <w:highlight w:val="yellow"/>
-        </w:rPr>
+        <w:rPr/>
         <w:t>Late discovery can require rework close to a submission deadline and leave less time for testing.</w:t>
       </w:r>
     </w:p>
@@ -880,10 +772,8 @@
         <w:spacing w:after="40"/>
       </w:pPr>
       <w:r>
-        <w:rPr>
-          <w:highlight w:val="yellow"/>
-        </w:rPr>
-        <w:t>Use small, focused pull requests and review each change before merging. Merge frequently after required checks pass; avoid merging unreviewed batches.</w:t>
+        <w:rPr/>
+        <w:t xml:space="preserve">Each member works on their own branch and opens a pull request into develop, which another member approves before merging; develop is released to main at the end of each iteration.</w:t>
       </w:r>
     </w:p>
     <w:p>
@@ -892,10 +782,8 @@
         <w:spacing w:after="40"/>
       </w:pPr>
       <w:r>
-        <w:rPr>
-          <w:highlight w:val="yellow"/>
-        </w:rPr>
-        <w:t>Record scope decisions and acceptance criteria in the project plan or issue tracker. Require the designated project owner’s approval for changes that affect agreed scope.</w:t>
+        <w:rPr/>
+        <w:t xml:space="preserve">Scope decisions and acceptance criteria are recorded in the Project Plan and on the Jira board.</w:t>
       </w:r>
     </w:p>
     <w:p>
@@ -904,10 +792,8 @@
         <w:spacing w:after="40"/>
       </w:pPr>
       <w:r>
-        <w:rPr>
-          <w:highlight w:val="yellow"/>
-        </w:rPr>
-        <w:t>Hold brief, scheduled integration check-ins and ensure documentation is updated alongside code changes.</w:t>
+        <w:rPr/>
+        <w:t xml:space="preserve">The team checks in at each meeting on open pull requests and updates the documents alongside the code.</w:t>
       </w:r>
     </w:p>
     <w:p>
@@ -930,10 +816,8 @@
         <w:spacing w:after="40"/>
       </w:pPr>
       <w:r>
-        <w:rPr>
-          <w:highlight w:val="yellow"/>
-        </w:rPr>
-        <w:t>Risk level: Medium (based on the reported rework; review at each iteration planning meeting).</w:t>
+        <w:rPr/>
+        <w:t xml:space="preserve">Risk level: Medium</w:t>
       </w:r>
     </w:p>
     <w:p>
@@ -942,9 +826,7 @@
         <w:spacing w:after="40"/>
       </w:pPr>
       <w:r>
-        <w:rPr>
-          <w:highlight w:val="yellow"/>
-        </w:rPr>
+        <w:rPr/>
         <w:t>Likelihood: Medium when requirements are not agreed before implementation begins.</w:t>
       </w:r>
     </w:p>
@@ -954,9 +836,7 @@
         <w:spacing w:after="40"/>
       </w:pPr>
       <w:r>
-        <w:rPr>
-          <w:highlight w:val="yellow"/>
-        </w:rPr>
+        <w:rPr/>
         <w:t>Impact: Low to Medium because unclear scope mainly causes rework and schedule pressure, but may also leave features incomplete.</w:t>
       </w:r>
     </w:p>
@@ -980,9 +860,7 @@
         <w:spacing w:after="40"/>
       </w:pPr>
       <w:r>
-        <w:rPr>
-          <w:highlight w:val="yellow"/>
-        </w:rPr>
+        <w:rPr/>
         <w:t>The team reconsidered two proposed features before settling scope.</w:t>
       </w:r>
     </w:p>
@@ -992,9 +870,7 @@
         <w:spacing w:after="40"/>
       </w:pPr>
       <w:r>
-        <w:rPr>
-          <w:highlight w:val="yellow"/>
-        </w:rPr>
+        <w:rPr/>
         <w:t>Documentation and implementation began before the team had recorded a final decision.</w:t>
       </w:r>
     </w:p>
@@ -1004,9 +880,7 @@
         <w:spacing w:after="40"/>
       </w:pPr>
       <w:r>
-        <w:rPr>
-          <w:highlight w:val="yellow"/>
-        </w:rPr>
+        <w:rPr/>
         <w:t>Some work had to be revised after the direction changed during an iteration.</w:t>
       </w:r>
     </w:p>
@@ -1030,10 +904,8 @@
         <w:spacing w:after="40"/>
       </w:pPr>
       <w:r>
-        <w:rPr>
-          <w:highlight w:val="yellow"/>
-        </w:rPr>
-        <w:t>Agree on scope, priorities, and acceptance criteria before implementation starts. Record the decision and the person approving it.</w:t>
+        <w:rPr/>
+        <w:t xml:space="preserve">Agree on scope, priorities, and acceptance criteria before implementation starts, and record who approved the decision.</w:t>
       </w:r>
     </w:p>
     <w:p>
@@ -1042,9 +914,7 @@
         <w:spacing w:after="40"/>
       </w:pPr>
       <w:r>
-        <w:rPr>
-          <w:highlight w:val="yellow"/>
-        </w:rPr>
+        <w:rPr/>
         <w:t>Log scope changes, their rationale, approver, and impact on schedule in the project plan’s revision log or issue tracker.</w:t>
       </w:r>
     </w:p>
@@ -1054,10 +924,8 @@
         <w:spacing w:after="40"/>
       </w:pPr>
       <w:r>
-        <w:rPr>
-          <w:highlight w:val="yellow"/>
-        </w:rPr>
-        <w:t>Treat undecided features as unapproved and do not implement them until a decision is recorded, unless the team explicitly agrees otherwise.</w:t>
+        <w:rPr/>
+        <w:t xml:space="preserve">Features that haven't been decided are not built until the decision is recorded.</w:t>
       </w:r>
     </w:p>
     <w:p>
@@ -1080,10 +948,8 @@
         <w:spacing w:after="40"/>
       </w:pPr>
       <w:r>
-        <w:rPr>
-          <w:highlight w:val="yellow"/>
-        </w:rPr>
-        <w:t>Risk level: High (replace the non-standard “Medium-High” label so all risks use the same rating scale).</w:t>
+        <w:rPr/>
+        <w:t xml:space="preserve">Risk level: High</w:t>
       </w:r>
     </w:p>
     <w:p>
@@ -1092,9 +958,7 @@
         <w:spacing w:after="40"/>
       </w:pPr>
       <w:r>
-        <w:rPr>
-          <w:highlight w:val="yellow"/>
-        </w:rPr>
+        <w:rPr/>
         <w:t>Likelihood: Medium because contributions can be missed if they exist only in local files, another person’s branch, or undocumented edits.</w:t>
       </w:r>
     </w:p>
@@ -1104,9 +968,7 @@
         <w:spacing w:after="40"/>
       </w:pPr>
       <w:r>
-        <w:rPr>
-          <w:highlight w:val="yellow"/>
-        </w:rPr>
+        <w:rPr/>
         <w:t>Impact: High because untracked work may be lost, difficult to review, or impossible to attribute and maintain.</w:t>
       </w:r>
     </w:p>
@@ -1130,10 +992,8 @@
         <w:spacing w:after="40"/>
       </w:pPr>
       <w:r>
-        <w:rPr>
-          <w:highlight w:val="yellow"/>
-        </w:rPr>
-        <w:t>The assessment found that one teammate’s contribution was not visible on that teammate’s branch.</w:t>
+        <w:rPr/>
+        <w:t xml:space="preserve">One teammate's contribution was not on that teammate's branch.</w:t>
       </w:r>
     </w:p>
     <w:p>
@@ -1142,9 +1002,7 @@
         <w:spacing w:after="40"/>
       </w:pPr>
       <w:r>
-        <w:rPr>
-          <w:highlight w:val="yellow"/>
-        </w:rPr>
+        <w:rPr/>
         <w:t>The contribution was discovered only because it had been included in another team member’s file.</w:t>
       </w:r>
     </w:p>
@@ -1154,9 +1012,7 @@
         <w:spacing w:after="40"/>
       </w:pPr>
       <w:r>
-        <w:rPr>
-          <w:highlight w:val="yellow"/>
-        </w:rPr>
+        <w:rPr/>
         <w:t>If the only copy had been lost or overwritten, the contribution could have been lost or difficult to recover.</w:t>
       </w:r>
     </w:p>
@@ -1180,10 +1036,8 @@
         <w:spacing w:after="40"/>
       </w:pPr>
       <w:r>
-        <w:rPr>
-          <w:highlight w:val="yellow"/>
-        </w:rPr>
-        <w:t>Store work in the shared repository using focused branches and pull requests. Where collaboration requires one person to commit another person’s changes, document the contributor and reason rather than imposing an impractical no-exceptions rule.</w:t>
+        <w:rPr/>
+        <w:t xml:space="preserve">All work is stored in the shared repository, on each person's own branch, and merged through pull requests. When one person has to commit another person's changes, the commit names the original contributor.</w:t>
       </w:r>
     </w:p>
     <w:p>
@@ -1192,10 +1046,8 @@
         <w:spacing w:after="40"/>
       </w:pPr>
       <w:r>
-        <w:rPr>
-          <w:highlight w:val="yellow"/>
-        </w:rPr>
-        <w:t>The project manager should review repository and issue-tracker status at each iteration checkpoint to confirm that deliverables have an owner, a tracked issue, and a recoverable version in source control.</w:t>
+        <w:rPr/>
+        <w:t xml:space="preserve">The project manager checks the repository and Jira board at each iteration checkpoint to make sure every deliverable has an owner, a Jira issue, and a copy in the repository.</w:t>
       </w:r>
     </w:p>
     <w:p>
@@ -1204,27 +1056,8 @@
         <w:spacing w:after="40"/>
       </w:pPr>
       <w:r>
-        <w:rPr>
-          <w:highlight w:val="yellow"/>
-        </w:rPr>
+        <w:rPr/>
         <w:t>Record contributions through commits, pull requests, issue links, and document revision history. Attribution in a document is useful but does not replace version control.</w:t>
-      </w:r>
-    </w:p>
-    <w:p>
-      <w:pPr/>
-      <w:r>
-        <w:rPr>
-          <w:highlight w:val="yellow"/>
-        </w:rPr>
-        <w:t>Review limitations and follow-up</w:t>
-      </w:r>
-    </w:p>
-    <w:p>
-      <w:r>
-        <w:rPr>
-          <w:highlight w:val="yellow"/>
-        </w:rPr>
-        <w:t>This assessment is based on the statements in the original document. The review did not independently inspect the AWS account, Git history, application code, or the 19 reported tests. Before submission, confirm the current status of each issue, record evidence for completed mitigations, assign an owner and review date to each open risk, and distinguish inherent risk from residual risk.</w:t>
       </w:r>
     </w:p>
     <w:p>
@@ -1387,10 +1220,8 @@
         <w:spacing w:after="40"/>
       </w:pPr>
       <w:r>
-        <w:rPr>
-          <w:highlight w:val="yellow"/>
-        </w:rPr>
-        <w:t>OWASP Top 10:2025, A04 Cryptographic Failures and A02 Security Misconfiguration (select the category that best matches the specific exposed-secret issue): https://owasp.org/Top10/2025/</w:t>
+        <w:rPr/>
+        <w:t xml:space="preserve">OWASP Top 10:2025, A02 Security Misconfiguration and A04 Cryptographic Failures: https://owasp.org/Top10/2025/</w:t>
       </w:r>
     </w:p>
     <w:p>
@@ -1413,9 +1244,7 @@
         <w:spacing w:after="40"/>
       </w:pPr>
       <w:r>
-        <w:rPr>
-          <w:highlight w:val="yellow"/>
-        </w:rPr>
+        <w:rPr/>
         <w:t>OWASP Top 10:2025, A01 Broken Access Control: https://owasp.org/Top10/2025/A01_2025-Broken_Access_Control/</w:t>
       </w:r>
     </w:p>

</xml_diff>